<commit_message>
Revise course outline for self-check module
</commit_message>
<xml_diff>
--- a/shilin-familyfin-two-day-course-outline-v0.1.docx
+++ b/shilin-familyfin-two-day-course-outline-v0.1.docx
@@ -44,7 +44,7 @@
         <w:t>課程目標：</w:t>
       </w:r>
       <w:r>
-        <w:t>讓夥伴能用好理家在完成一段安全示範：先把語音或文字資料整理成可讀紀錄，再放入個案歷程脈絡，接著用時間盤點工具整理用藥、回診與服務追蹤節點。第二天則把個案歷程紀要延伸成工作流，再用知識庫、問問 AI 與社工儀表板查找可審稿的支持資源，並認識免費財務諮詢與急難專區的使用邊界。</w:t>
+        <w:t>讓夥伴能用好理家在完成一段安全示範：第一天先把手機錄音或文字資料整理成可讀紀錄，放入個案歷程紀要，再用時間資源盤點與知識查找工具看見可改善的工作段落。第二天則導覽好理家在既有自我檢測，並討論未來可合作設計心理相關自我檢測的可能、邊界與人工接續方式。</w:t>
       </w:r>
     </w:p>
     <w:p>
@@ -52,7 +52,7 @@
         <w:pStyle w:val="Heading1"/>
       </w:pPr>
       <w:r>
-        <w:t>第一堂：紀錄與時間管理基礎</w:t>
+        <w:t>第一堂：紀錄、個案歷程與時間盤點</w:t>
       </w:r>
     </w:p>
     <w:tbl>
@@ -247,7 +247,7 @@
                 <w:b w:val="0"/>
                 <w:sz w:val="20"/>
               </w:rPr>
-              <w:t>回到夥伴提出的五項需求，先確認第一天聚焦「紀錄變文字、文字進歷程、時間可盤點」三件事。</w:t>
+              <w:t>回到夥伴提出的五項需求，先確認第一天聚焦「錄音與文字整理、個案歷程紀要、時間資源盤點、知識查找」四件事。</w:t>
             </w:r>
           </w:p>
         </w:tc>
@@ -324,7 +324,7 @@
                 <w:b/>
                 <w:sz w:val="20"/>
               </w:rPr>
-              <w:t>語音轉文字</w:t>
+              <w:t>手機錄音與語音轉文字</w:t>
             </w:r>
           </w:p>
         </w:tc>
@@ -451,7 +451,7 @@
                 <w:b w:val="0"/>
                 <w:sz w:val="20"/>
               </w:rPr>
-              <w:t>把剛剛整理出的文字放入歷程脈絡，練習區分事件、處遇、觀察、待確認與下一步，不把工具輸出直接當正式紀錄。</w:t>
+              <w:t>把剛剛整理出的文字放入個案歷程脈絡，練習區分事件、處遇、觀察、待確認與下一步；同時示範人工審核欄位，不把工具輸出直接當正式紀錄。</w:t>
             </w:r>
           </w:p>
         </w:tc>
@@ -629,7 +629,7 @@
                 <w:b/>
                 <w:sz w:val="20"/>
               </w:rPr>
-              <w:t>時間盤點工具</w:t>
+              <w:t>時間資源盤點</w:t>
             </w:r>
           </w:p>
         </w:tc>
@@ -654,7 +654,7 @@
                 <w:b w:val="0"/>
                 <w:sz w:val="20"/>
               </w:rPr>
-              <w:t>使用課程時已上線的時間盤點工具，整理一週工作時間、回診/用藥提醒節點、服務追蹤等待與交接時間，找出最適合導入工具協助的工作段落。</w:t>
+              <w:t>參考時間資源盤點工具的實際流程：選一段時間、填活動內容、新增紀錄，再查看今日 24 小時盤點、已記錄時數、可補充時間與最近紀錄；課堂只用模擬活動記錄討論工作時間花在哪裡。</w:t>
             </w:r>
           </w:p>
         </w:tc>
@@ -679,7 +679,7 @@
                 <w:b w:val="0"/>
                 <w:sz w:val="20"/>
               </w:rPr>
-              <w:t>時間盤點工具、時間盤點範例表、服務追蹤節點清單</w:t>
+              <w:t>時間資源盤點工具、模擬活動紀錄</w:t>
             </w:r>
           </w:p>
         </w:tc>
@@ -756,7 +756,7 @@
                 <w:b w:val="0"/>
                 <w:sz w:val="20"/>
               </w:rPr>
-              <w:t>讓夥伴選一段低風險、可去識別化的模擬資料，決定第二堂要用它設計個案歷程紀要與服務追蹤工作流。</w:t>
+              <w:t>示範用知識庫、問問 AI 與社工儀表板查找概括資源，整理成可審稿草稿；最後讓夥伴選一段低風險、可去識別化的材料，帶到第二堂自我檢測討論。</w:t>
             </w:r>
           </w:p>
         </w:tc>
@@ -781,7 +781,7 @@
                 <w:b w:val="0"/>
                 <w:sz w:val="20"/>
               </w:rPr>
-              <w:t>課後練習單、兩週小試行紀錄表</w:t>
+              <w:t>知識庫、問問 AI、社工儀表板、課後練習單</w:t>
             </w:r>
           </w:p>
         </w:tc>
@@ -793,7 +793,7 @@
         <w:pStyle w:val="Heading1"/>
       </w:pPr>
       <w:r>
-        <w:t>第二堂：工作流與資源入口</w:t>
+        <w:t>第二堂：自我檢測與心理相關自我檢測共創</w:t>
       </w:r>
     </w:p>
     <w:tbl>
@@ -963,7 +963,7 @@
                 <w:b/>
                 <w:sz w:val="20"/>
               </w:rPr>
-              <w:t>回顧與工作流目標</w:t>
+              <w:t>回顧與自我檢測定位</w:t>
             </w:r>
           </w:p>
         </w:tc>
@@ -988,7 +988,7 @@
                 <w:b w:val="0"/>
                 <w:sz w:val="20"/>
               </w:rPr>
-              <w:t>回顧第一堂的三組工具，確認第二堂要把個案歷程紀要、資源查找與諮詢/急難入口串成一段可試行流程。</w:t>
+              <w:t>回顧第一堂輸出的模擬紀錄與時間盤點，說明第二堂聚焦自我檢測：作為覺察、討論與資源連結入口，不作診斷或正式評估。</w:t>
             </w:r>
           </w:p>
         </w:tc>
@@ -1013,7 +1013,7 @@
                 <w:b w:val="0"/>
                 <w:sz w:val="20"/>
               </w:rPr>
-              <w:t>第一堂摘要、流程圖</w:t>
+              <w:t>第一堂摘要、自我檢測定位卡</w:t>
             </w:r>
           </w:p>
         </w:tc>
@@ -1065,7 +1065,7 @@
                 <w:b/>
                 <w:sz w:val="20"/>
               </w:rPr>
-              <w:t>個案歷程紀要工作流</w:t>
+              <w:t>好理家在既有自我檢測</w:t>
             </w:r>
           </w:p>
         </w:tc>
@@ -1090,7 +1090,7 @@
                 <w:b w:val="0"/>
                 <w:sz w:val="20"/>
               </w:rPr>
-              <w:t>拆解輸入、整理、人工審核、回到正式紀錄的流程，標註哪些欄位可由好理家在協助，哪些必須由心理師判斷。</w:t>
+              <w:t>導覽財務焦慮檢測、財務韌性檢測、詐騙防禦能力檢測等工具可以如何作為自我覺察與討論材料；只看題目、結果呈現與提醒語，不把結果當專業結論。</w:t>
             </w:r>
           </w:p>
         </w:tc>
@@ -1115,7 +1115,7 @@
                 <w:b w:val="0"/>
                 <w:sz w:val="20"/>
               </w:rPr>
-              <w:t>流程圖、欄位清單、模擬紀錄</w:t>
+              <w:t>好理家在自我檢測工具、模擬填答資料</w:t>
             </w:r>
           </w:p>
         </w:tc>
@@ -1167,7 +1167,7 @@
                 <w:b/>
                 <w:sz w:val="20"/>
               </w:rPr>
-              <w:t>知識庫、問問 AI 與社工儀表板</w:t>
+              <w:t>自我檢測結果讀法</w:t>
             </w:r>
           </w:p>
         </w:tc>
@@ -1192,7 +1192,7 @@
                 <w:b w:val="0"/>
                 <w:sz w:val="20"/>
               </w:rPr>
-              <w:t>用概括問題查找資源與說明文字，練習把工具輸出改成可審稿草稿，並標註哪些內容需要人工查核。</w:t>
+              <w:t>示範如何閱讀既有自我檢測的題目、結果呈現與提醒語，練習把結果整理成「可作討論材料」與「需要人工接續」兩類。</w:t>
             </w:r>
           </w:p>
         </w:tc>
@@ -1217,7 +1217,7 @@
                 <w:b w:val="0"/>
                 <w:sz w:val="20"/>
               </w:rPr>
-              <w:t>社工儀表板、知識庫、問問 AI、審稿清單</w:t>
+              <w:t>好理家在自我檢測工具、模擬填答資料、人工接續清單</w:t>
             </w:r>
           </w:p>
         </w:tc>
@@ -1294,7 +1294,7 @@
                 <w:b w:val="0"/>
                 <w:sz w:val="20"/>
               </w:rPr>
-              <w:t>把資源查找結果整理成「可作草稿」與「需要人工查核」兩類。</w:t>
+              <w:t>把自我檢測結果整理成「可作討論材料」與「需要人工接續」兩類。</w:t>
             </w:r>
           </w:p>
         </w:tc>
@@ -1370,7 +1370,7 @@
                 <w:b/>
                 <w:sz w:val="20"/>
               </w:rPr>
-              <w:t>免費財務諮詢</w:t>
+              <w:t>心理相關自我檢測共創可能</w:t>
             </w:r>
           </w:p>
         </w:tc>
@@ -1395,7 +1395,7 @@
                 <w:b w:val="0"/>
                 <w:sz w:val="20"/>
               </w:rPr>
-              <w:t>導覽好理家在免費財務諮詢入口，說明適用情境、資料準備、告知同意與不代填送出的原則。</w:t>
+              <w:t>討論未來若要合作設計心理相關自我檢測，需要先定義目的、題項、回饋語、分流方式、人工接續與禁止使用範圍；本課只做設計討論，不宣稱好理家在已有心理檢測。</w:t>
             </w:r>
           </w:p>
         </w:tc>
@@ -1420,7 +1420,7 @@
                 <w:b w:val="0"/>
                 <w:sz w:val="20"/>
               </w:rPr>
-              <w:t>好理家在線上諮詢、資料需求清單</w:t>
+              <w:t>共創草圖、題項範例格式、安全邊界清單</w:t>
             </w:r>
           </w:p>
         </w:tc>
@@ -1472,7 +1472,7 @@
                 <w:b/>
                 <w:sz w:val="20"/>
               </w:rPr>
-              <w:t>急難專區</w:t>
+              <w:t>自我檢測到資源連結</w:t>
             </w:r>
           </w:p>
         </w:tc>
@@ -1497,7 +1497,7 @@
                 <w:b w:val="0"/>
                 <w:sz w:val="20"/>
               </w:rPr>
-              <w:t>導覽急難救助與相關申請入口，只看流程、欄位類型與需要確認的資料，不用真實個案示範送出。</w:t>
+              <w:t>討論自我檢測結果如何回到人工會談、知識庫查找、問問 AI 草稿、免費財務諮詢或急難入口；只說明入口與資料需求，不代填、不送出。</w:t>
             </w:r>
           </w:p>
         </w:tc>
@@ -1522,7 +1522,7 @@
                 <w:b w:val="0"/>
                 <w:sz w:val="20"/>
               </w:rPr>
-              <w:t>好理家在急難專區、紅黃綠燈表</w:t>
+              <w:t>知識庫、問問 AI、線上諮詢與急難入口示意</w:t>
             </w:r>
           </w:p>
         </w:tc>
@@ -1599,7 +1599,7 @@
                 <w:b w:val="0"/>
                 <w:sz w:val="20"/>
               </w:rPr>
-              <w:t>完成試行紀錄表：選定一段工作流、列出使用工具、輸入材料類型、人工修正、安全疑慮與回饋方式。</w:t>
+              <w:t>完成兩週小試行設計：選一個既有自我檢測或一個心理相關自我檢測構想，列出使用目的、適用對象、人工接續、不可使用範圍與回饋方式。</w:t>
             </w:r>
           </w:p>
         </w:tc>
@@ -1624,7 +1624,7 @@
                 <w:b w:val="0"/>
                 <w:sz w:val="20"/>
               </w:rPr>
-              <w:t>兩週小試行紀錄表、回饋表</w:t>
+              <w:t>兩週小試行紀錄表、自我檢測共創草稿</w:t>
             </w:r>
           </w:p>
         </w:tc>

</xml_diff>

<commit_message>
Clarify time audit tracking workflow bridge
</commit_message>
<xml_diff>
--- a/shilin-familyfin-two-day-course-outline-v0.1.docx
+++ b/shilin-familyfin-two-day-course-outline-v0.1.docx
@@ -44,7 +44,7 @@
         <w:t>課程目標：</w:t>
       </w:r>
       <w:r>
-        <w:t>讓夥伴能用好理家在完成一段安全示範：第一天先把手機錄音或文字資料整理成可讀紀錄，放入個案歷程紀要，再用時間資源盤點與知識查找工具看見可改善的工作段落。第二天則導覽好理家在既有自我檢測，並討論未來可合作設計心理相關自我檢測的可能、邊界與人工接續方式。</w:t>
+        <w:t>讓夥伴能用好理家在完成一段安全示範：第一天先把手機錄音或文字資料整理成可讀紀錄，放入個案歷程紀要，再用時間資源盤點與知識查找工具看見可改善的工作段落，包含用藥追蹤、服務追蹤未來可銜接的位置。第二天則導覽好理家在既有自我檢測，並討論未來可合作設計心理相關自我檢測的可能、邊界與人工接續方式。</w:t>
       </w:r>
     </w:p>
     <w:p>
@@ -654,7 +654,7 @@
                 <w:b w:val="0"/>
                 <w:sz w:val="20"/>
               </w:rPr>
-              <w:t>參考時間資源盤點工具的實際流程：選一段時間、填活動內容、新增紀錄，再查看今日 24 小時盤點、已記錄時數、可補充時間與最近紀錄；課堂只用模擬活動記錄討論工作時間花在哪裡。</w:t>
+              <w:t>參考時間資源盤點工具的實際流程：選一段時間、填活動內容、新增紀錄，再查看今日 24 小時盤點、已記錄時數、可補充時間與最近紀錄；課堂可用模擬活動記錄討論工作時間花在哪裡，以及用藥追蹤、服務追蹤若要銜接流程，可能會落在哪些時間段。</w:t>
             </w:r>
           </w:p>
         </w:tc>

</xml_diff>

<commit_message>
Revise second session for case interaction resources
</commit_message>
<xml_diff>
--- a/shilin-familyfin-two-day-course-outline-v0.1.docx
+++ b/shilin-familyfin-two-day-course-outline-v0.1.docx
@@ -44,7 +44,7 @@
         <w:t>課程目標：</w:t>
       </w:r>
       <w:r>
-        <w:t>讓夥伴能用好理家在完成一段安全示範：第一天先把手機錄音或文字資料整理成可讀紀錄，放入個案歷程紀要，再用時間資源盤點與知識查找工具看見可改善的工作段落，包含用藥追蹤、服務追蹤未來可銜接的位置。第二天則導覽好理家在既有自我檢測，並討論未來可合作設計心理相關自我檢測的可能、邊界與人工接續方式。</w:t>
+        <w:t>讓夥伴能用好理家在完成一段安全示範：第一天先把手機錄音或文字資料整理成可讀紀錄，放入個案歷程紀要，再用時間資源盤點與知識查找工具看見可改善的工作段落，包含用藥追蹤、服務追蹤未來可銜接的位置。第二天則示範如何陪個案使用既有檢測互動、如何投稿心理相關知識擴充知識庫與 AI 回答能力，以及如何連到免費線上財務諮詢與急難專區。</w:t>
       </w:r>
     </w:p>
     <w:p>
@@ -756,7 +756,7 @@
                 <w:b w:val="0"/>
                 <w:sz w:val="20"/>
               </w:rPr>
-              <w:t>示範用知識庫、問問 AI 與社工儀表板查找概括資源，整理成可審稿草稿；最後讓夥伴選一段低風險、可去識別化的材料，帶到第二堂自我檢測討論。</w:t>
+              <w:t>示範用知識庫、問問 AI 與社工儀表板查找概括資源，整理成可審稿草稿；最後讓夥伴選一段低風險、可去識別化的材料，帶到第二堂檢測互動與資源連結討論。</w:t>
             </w:r>
           </w:p>
         </w:tc>
@@ -793,7 +793,7 @@
         <w:pStyle w:val="Heading1"/>
       </w:pPr>
       <w:r>
-        <w:t>第二堂：自我檢測與心理相關自我檢測共創</w:t>
+        <w:t>第二堂：檢測互動、知識投稿與資源連結</w:t>
       </w:r>
     </w:p>
     <w:tbl>
@@ -963,7 +963,7 @@
                 <w:b/>
                 <w:sz w:val="20"/>
               </w:rPr>
-              <w:t>回顧與自我檢測定位</w:t>
+              <w:t>個案互動情境對焦</w:t>
             </w:r>
           </w:p>
         </w:tc>
@@ -988,7 +988,7 @@
                 <w:b w:val="0"/>
                 <w:sz w:val="20"/>
               </w:rPr>
-              <w:t>回顧第一堂輸出的模擬紀錄與時間盤點，說明第二堂聚焦自我檢測：作為覺察、討論與資源連結入口，不作診斷或正式評估。</w:t>
+              <w:t>回顧第一堂輸出的模擬紀錄與時間盤點，改從「夥伴如何陪個案使用好理家在」出發，確認檢測只是覺察、對話與資源連結入口，不作診斷或正式評估。</w:t>
             </w:r>
           </w:p>
         </w:tc>
@@ -1013,7 +1013,7 @@
                 <w:b w:val="0"/>
                 <w:sz w:val="20"/>
               </w:rPr>
-              <w:t>第一堂摘要、自我檢測定位卡</w:t>
+              <w:t>第一堂摘要、個案互動情境卡</w:t>
             </w:r>
           </w:p>
         </w:tc>
@@ -1065,7 +1065,7 @@
                 <w:b/>
                 <w:sz w:val="20"/>
               </w:rPr>
-              <w:t>好理家在既有自我檢測</w:t>
+              <w:t>用檢測與個案互動</w:t>
             </w:r>
           </w:p>
         </w:tc>
@@ -1090,7 +1090,7 @@
                 <w:b w:val="0"/>
                 <w:sz w:val="20"/>
               </w:rPr>
-              <w:t>導覽財務焦慮檢測、財務韌性檢測、詐騙防禦能力檢測等工具可以如何作為自我覺察與討論材料；只看題目、結果呈現與提醒語，不把結果當專業結論。</w:t>
+              <w:t>導覽財務焦慮檢測、財務韌性檢測、詐騙防禦能力檢測等工具，示範助人工作者如何陪個案看題目、填答、閱讀結果與引出可討論的生活壓力或資源需求。</w:t>
             </w:r>
           </w:p>
         </w:tc>
@@ -1115,7 +1115,7 @@
                 <w:b w:val="0"/>
                 <w:sz w:val="20"/>
               </w:rPr>
-              <w:t>好理家在自我檢測工具、模擬填答資料</w:t>
+              <w:t>好理家在檢測工具、模擬個案互動腳本</w:t>
             </w:r>
           </w:p>
         </w:tc>
@@ -1167,7 +1167,7 @@
                 <w:b/>
                 <w:sz w:val="20"/>
               </w:rPr>
-              <w:t>自我檢測結果讀法</w:t>
+              <w:t>檢測結果到人工接續</w:t>
             </w:r>
           </w:p>
         </w:tc>
@@ -1192,7 +1192,7 @@
                 <w:b w:val="0"/>
                 <w:sz w:val="20"/>
               </w:rPr>
-              <w:t>示範如何閱讀既有自我檢測的題目、結果呈現與提醒語，練習把結果整理成「可作討論材料」與「需要人工接續」兩類。</w:t>
+              <w:t>練習把檢測結果整理成「可與個案討論的觀察」、「需要人工確認的問題」與「可能需要資源連結」三類，避免把分數或結果當成心理診斷。</w:t>
             </w:r>
           </w:p>
         </w:tc>
@@ -1217,7 +1217,7 @@
                 <w:b w:val="0"/>
                 <w:sz w:val="20"/>
               </w:rPr>
-              <w:t>好理家在自我檢測工具、模擬填答資料、人工接續清單</w:t>
+              <w:t>模擬填答資料、人工接續清單</w:t>
             </w:r>
           </w:p>
         </w:tc>
@@ -1294,7 +1294,7 @@
                 <w:b w:val="0"/>
                 <w:sz w:val="20"/>
               </w:rPr>
-              <w:t>把自我檢測結果整理成「可作討論材料」與「需要人工接續」兩類。</w:t>
+              <w:t>把檢測互動整理成「可討論」、「需人工確認」與「可能需要資源」三類。</w:t>
             </w:r>
           </w:p>
         </w:tc>
@@ -1370,7 +1370,7 @@
                 <w:b/>
                 <w:sz w:val="20"/>
               </w:rPr>
-              <w:t>心理相關自我檢測共創可能</w:t>
+              <w:t>知識庫投稿與心理知識擴充</w:t>
             </w:r>
           </w:p>
         </w:tc>
@@ -1395,7 +1395,7 @@
                 <w:b w:val="0"/>
                 <w:sz w:val="20"/>
               </w:rPr>
-              <w:t>討論未來若要合作設計心理相關自我檢測，需要先定義目的、題項、回饋語、分流方式、人工接續與禁止使用範圍；本課只做設計討論，不宣稱好理家在已有心理檢測。</w:t>
+              <w:t>說明好理家在有知識庫，也鼓勵夥伴投稿心理相關知識、常見問答、陪伴技巧或助人工作者觀點；透過審稿與去識別化，讓知識庫累積更多心理相關內容，也讓 AI 未來更能回答心理相關問題。</w:t>
             </w:r>
           </w:p>
         </w:tc>
@@ -1420,7 +1420,7 @@
                 <w:b w:val="0"/>
                 <w:sz w:val="20"/>
               </w:rPr>
-              <w:t>共創草圖、題項範例格式、安全邊界清單</w:t>
+              <w:t>知識庫、投稿主題清單、審稿與去識別化規則</w:t>
             </w:r>
           </w:p>
         </w:tc>
@@ -1472,7 +1472,7 @@
                 <w:b/>
                 <w:sz w:val="20"/>
               </w:rPr>
-              <w:t>自我檢測到資源連結</w:t>
+              <w:t>免費線上財務諮詢與急難專區</w:t>
             </w:r>
           </w:p>
         </w:tc>
@@ -1497,7 +1497,7 @@
                 <w:b w:val="0"/>
                 <w:sz w:val="20"/>
               </w:rPr>
-              <w:t>討論自我檢測結果如何回到人工會談、知識庫查找、問問 AI 草稿、免費財務諮詢或急難入口；只說明入口與資料需求，不代填、不送出。</w:t>
+              <w:t>當個案需要資源協助時，導覽免費線上財務諮詢；這不只可協助個案，也可協助助人工作者釐清財務與資源問題。另介紹急難專區可如何回報或使用；課堂只說明入口、資料需求與告知同意，不代填、不送出。</w:t>
             </w:r>
           </w:p>
         </w:tc>
@@ -1522,7 +1522,7 @@
                 <w:b w:val="0"/>
                 <w:sz w:val="20"/>
               </w:rPr>
-              <w:t>知識庫、問問 AI、線上諮詢與急難入口示意</w:t>
+              <w:t>免費線上財務諮詢、社工專業諮詢、急難專區、資料需求清單</w:t>
             </w:r>
           </w:p>
         </w:tc>
@@ -1599,7 +1599,7 @@
                 <w:b w:val="0"/>
                 <w:sz w:val="20"/>
               </w:rPr>
-              <w:t>完成兩週小試行設計：選一個既有自我檢測或一個心理相關自我檢測構想，列出使用目的、適用對象、人工接續、不可使用範圍與回饋方式。</w:t>
+              <w:t>完成兩週小試行設計：選一個檢測個案互動場景、一個心理相關知識投稿主題，或一個資源連結流程，列出使用目的、適用對象、人工接續、不可使用範圍與回饋方式。</w:t>
             </w:r>
           </w:p>
         </w:tc>
@@ -1624,7 +1624,7 @@
                 <w:b w:val="0"/>
                 <w:sz w:val="20"/>
               </w:rPr>
-              <w:t>兩週小試行紀錄表、自我檢測共創草稿</w:t>
+              <w:t>兩週小試行紀錄表、投稿主題卡、資源連結流程草稿</w:t>
             </w:r>
           </w:p>
         </w:tc>

</xml_diff>